<commit_message>
feat: integrate TaxInspector Agent V5 Production
- Add LoRA V5 adapter weights trained on 130k production dataset
- Update AgenticLLM to use 21 backend tools including new GraphRAG and HeteroGNN modules
- Update valid tools and tool-to-intent map for dynamic frontend visualization
- Include scripts for V5 SFT dataset generation and testing
</commit_message>
<xml_diff>
--- a/Backend/tests/output/test_report.docx
+++ b/Backend/tests/output/test_report.docx
@@ -39,7 +39,7 @@
         <w:jc w:val="right"/>
       </w:pPr>
       <w:r>
-        <w:t>Số: 202605121525/BC-TTAI</w:t>
+        <w:t>Số: 202605131535/BC-TTAI</w:t>
       </w:r>
     </w:p>
     <w:p>
@@ -47,7 +47,7 @@
         <w:jc w:val="right"/>
       </w:pPr>
       <w:r>
-        <w:t>Ngày: 12/05/2026</w:t>
+        <w:t>Ngày: 13/05/2026</w:t>
       </w:r>
     </w:p>
     <w:p>

</xml_diff>